<commit_message>
mise a jour dataSet
</commit_message>
<xml_diff>
--- a/backend/DATASET_CHATBOT.docx
+++ b/backend/DATASET_CHATBOT.docx
@@ -887,7 +887,7 @@
                 <w:vertAlign w:val="baseline"/>
                 <w:lang w:val="en-US"/>
               </w:rPr>
-              <w:t>Depot minimal : - 25.000FCFA sans domiciliation.   - Entrepreneur, artisants, éleveurs, TPE 50.000FCFA.  - Gratuit avec domiciliation.</w:t>
+              <w:t>Dépôt minimal : - 25.000FCFA sans domiciliation.   - Entrepreneur, artisants, éleveurs, TPE 50.000FCFA.  - Gratuit avec domiciliation.</w:t>
             </w:r>
           </w:p>
           <w:p>
@@ -975,7 +975,7 @@
                 <w:vertAlign w:val="baseline"/>
                 <w:lang w:val="en-US"/>
               </w:rPr>
-              <w:t>Plan de localisation.</w:t>
+              <w:t>Plan de localisation de votre domicile et une copie de la facture de paiement électricité ou d’eau.</w:t>
             </w:r>
           </w:p>
           <w:p>
@@ -3648,19 +3648,712 @@
                 <w:bCs w:val="0"/>
                 <w:lang w:val="en-US"/>
               </w:rPr>
-              <w:t>Savoir quel type de crédit</w:t>
+              <w:t>Savoir quel type de crédit vous voulez</w:t>
+            </w:r>
+          </w:p>
+        </w:tc>
+      </w:tr>
+      <w:tr>
+        <w:tblPrEx>
+          <w:tblBorders>
+            <w:top w:val="single" w:color="auto" w:sz="4" w:space="0"/>
+            <w:left w:val="single" w:color="auto" w:sz="4" w:space="0"/>
+            <w:bottom w:val="single" w:color="auto" w:sz="4" w:space="0"/>
+            <w:right w:val="single" w:color="auto" w:sz="4" w:space="0"/>
+            <w:insideH w:val="single" w:color="auto" w:sz="4" w:space="0"/>
+            <w:insideV w:val="single" w:color="auto" w:sz="4" w:space="0"/>
+          </w:tblBorders>
+          <w:tblCellMar>
+            <w:top w:w="0" w:type="dxa"/>
+            <w:left w:w="108" w:type="dxa"/>
+            <w:bottom w:w="0" w:type="dxa"/>
+            <w:right w:w="108" w:type="dxa"/>
+          </w:tblCellMar>
+        </w:tblPrEx>
+        <w:trPr>
+          <w:trHeight w:val="2506" w:hRule="atLeast"/>
+        </w:trPr>
+        <w:tc>
+          <w:tcPr>
+            <w:tcW w:w="2840" w:type="dxa"/>
+            <w:vAlign w:val="top"/>
+          </w:tcPr>
+          <w:p>
+            <w:pPr>
+              <w:rPr>
+                <w:rFonts w:hint="default"/>
+                <w:vertAlign w:val="baseline"/>
+                <w:lang w:val="en-US"/>
+              </w:rPr>
+            </w:pPr>
+            <w:r>
+              <w:rPr>
+                <w:rFonts w:hint="default"/>
+                <w:vertAlign w:val="baseline"/>
+                <w:lang w:val="en-US"/>
+              </w:rPr>
+              <w:t>Renseigenments</w:t>
+            </w:r>
+          </w:p>
+        </w:tc>
+        <w:tc>
+          <w:tcPr>
+            <w:tcW w:w="2841" w:type="dxa"/>
+            <w:vAlign w:val="top"/>
+          </w:tcPr>
+          <w:p>
+            <w:pPr>
+              <w:rPr>
+                <w:rFonts w:hint="default"/>
+                <w:vertAlign w:val="baseline"/>
+                <w:lang w:val="en-US"/>
+              </w:rPr>
+            </w:pPr>
+            <w:r>
+              <w:rPr>
+                <w:rFonts w:hint="default"/>
+                <w:vertAlign w:val="baseline"/>
+                <w:lang w:val="en-US"/>
+              </w:rPr>
+              <w:t>Quel est l’avantage d’avoir un compte au CCA Bank</w:t>
+            </w:r>
+          </w:p>
+        </w:tc>
+        <w:tc>
+          <w:tcPr>
+            <w:tcW w:w="3364" w:type="dxa"/>
+            <w:vAlign w:val="top"/>
+          </w:tcPr>
+          <w:p>
+            <w:pPr>
+              <w:numPr>
+                <w:ilvl w:val="0"/>
+                <w:numId w:val="3"/>
+              </w:numPr>
+              <w:ind w:left="420" w:leftChars="0" w:hanging="420" w:firstLineChars="0"/>
+              <w:rPr>
+                <w:rFonts w:hint="default"/>
+                <w:b w:val="0"/>
+                <w:bCs w:val="0"/>
+                <w:lang w:val="en-US"/>
+              </w:rPr>
+            </w:pPr>
+            <w:r>
+              <w:rPr>
+                <w:rFonts w:hint="default"/>
+                <w:b w:val="0"/>
+                <w:bCs w:val="0"/>
+                <w:lang w:val="en-US"/>
+              </w:rPr>
+              <w:t>Financial  Growth</w:t>
+            </w:r>
+          </w:p>
+          <w:p>
+            <w:pPr>
+              <w:numPr>
+                <w:ilvl w:val="0"/>
+                <w:numId w:val="3"/>
+              </w:numPr>
+              <w:ind w:left="420" w:leftChars="0" w:hanging="420" w:firstLineChars="0"/>
+              <w:rPr>
+                <w:rFonts w:hint="default"/>
+                <w:b w:val="0"/>
+                <w:bCs w:val="0"/>
+                <w:lang w:val="en-US"/>
+              </w:rPr>
+            </w:pPr>
+            <w:r>
+              <w:rPr>
+                <w:rFonts w:hint="default"/>
+                <w:b w:val="0"/>
+                <w:bCs w:val="0"/>
+                <w:lang w:val="en-US"/>
+              </w:rPr>
+              <w:t>Companionship</w:t>
+            </w:r>
+          </w:p>
+          <w:p>
+            <w:pPr>
+              <w:numPr>
+                <w:ilvl w:val="0"/>
+                <w:numId w:val="3"/>
+              </w:numPr>
+              <w:ind w:left="420" w:leftChars="0" w:hanging="420" w:firstLineChars="0"/>
+              <w:rPr>
+                <w:rFonts w:hint="default"/>
+                <w:b w:val="0"/>
+                <w:bCs w:val="0"/>
+                <w:lang w:val="en-US"/>
+              </w:rPr>
+            </w:pPr>
+            <w:r>
+              <w:rPr>
+                <w:rFonts w:hint="default"/>
+                <w:b w:val="0"/>
+                <w:bCs w:val="0"/>
+                <w:lang w:val="en-US"/>
+              </w:rPr>
+              <w:t>Financial security</w:t>
+            </w:r>
+          </w:p>
+        </w:tc>
+      </w:tr>
+      <w:tr>
+        <w:tblPrEx>
+          <w:tblBorders>
+            <w:top w:val="single" w:color="auto" w:sz="4" w:space="0"/>
+            <w:left w:val="single" w:color="auto" w:sz="4" w:space="0"/>
+            <w:bottom w:val="single" w:color="auto" w:sz="4" w:space="0"/>
+            <w:right w:val="single" w:color="auto" w:sz="4" w:space="0"/>
+            <w:insideH w:val="single" w:color="auto" w:sz="4" w:space="0"/>
+            <w:insideV w:val="single" w:color="auto" w:sz="4" w:space="0"/>
+          </w:tblBorders>
+          <w:tblCellMar>
+            <w:top w:w="0" w:type="dxa"/>
+            <w:left w:w="108" w:type="dxa"/>
+            <w:bottom w:w="0" w:type="dxa"/>
+            <w:right w:w="108" w:type="dxa"/>
+          </w:tblCellMar>
+        </w:tblPrEx>
+        <w:trPr>
+          <w:trHeight w:val="2506" w:hRule="atLeast"/>
+        </w:trPr>
+        <w:tc>
+          <w:tcPr>
+            <w:tcW w:w="2840" w:type="dxa"/>
+            <w:vAlign w:val="top"/>
+          </w:tcPr>
+          <w:p>
+            <w:pPr>
+              <w:rPr>
+                <w:rFonts w:hint="default"/>
+                <w:vertAlign w:val="baseline"/>
+                <w:lang w:val="en-US"/>
+              </w:rPr>
+            </w:pPr>
+            <w:r>
+              <w:rPr>
+                <w:rFonts w:hint="default"/>
+                <w:vertAlign w:val="baseline"/>
+                <w:lang w:val="en-US"/>
+              </w:rPr>
+              <w:t>compte</w:t>
+            </w:r>
+          </w:p>
+        </w:tc>
+        <w:tc>
+          <w:tcPr>
+            <w:tcW w:w="2841" w:type="dxa"/>
+            <w:vAlign w:val="top"/>
+          </w:tcPr>
+          <w:p>
+            <w:pPr>
+              <w:rPr>
+                <w:rFonts w:hint="default"/>
+                <w:vertAlign w:val="baseline"/>
+                <w:lang w:val="en-US"/>
+              </w:rPr>
+            </w:pPr>
+            <w:r>
+              <w:rPr>
+                <w:rFonts w:hint="default"/>
+                <w:vertAlign w:val="baseline"/>
+                <w:lang w:val="en-US"/>
+              </w:rPr>
+              <w:t>Comment  conclurez mon compte?</w:t>
+            </w:r>
+          </w:p>
+        </w:tc>
+        <w:tc>
+          <w:tcPr>
+            <w:tcW w:w="3364" w:type="dxa"/>
+            <w:vAlign w:val="top"/>
+          </w:tcPr>
+          <w:p>
+            <w:pPr>
+              <w:numPr>
+                <w:ilvl w:val="0"/>
+                <w:numId w:val="3"/>
+              </w:numPr>
+              <w:ind w:left="420" w:leftChars="0" w:hanging="420" w:firstLineChars="0"/>
+              <w:rPr>
+                <w:rFonts w:hint="default"/>
+                <w:b w:val="0"/>
+                <w:bCs w:val="0"/>
+                <w:lang w:val="en-US"/>
+              </w:rPr>
+            </w:pPr>
+            <w:r>
+              <w:rPr>
+                <w:rFonts w:hint="default"/>
+                <w:b w:val="0"/>
+                <w:bCs w:val="0"/>
+                <w:lang w:val="en-US"/>
+              </w:rPr>
+              <w:t>Write   a   demand</w:t>
+            </w:r>
+          </w:p>
+          <w:p>
+            <w:pPr>
+              <w:numPr>
+                <w:ilvl w:val="0"/>
+                <w:numId w:val="3"/>
+              </w:numPr>
+              <w:ind w:left="420" w:leftChars="0" w:hanging="420" w:firstLineChars="0"/>
+              <w:rPr>
+                <w:rFonts w:hint="default"/>
+                <w:b w:val="0"/>
+                <w:bCs w:val="0"/>
+                <w:lang w:val="en-US"/>
+              </w:rPr>
+            </w:pPr>
+            <w:r>
+              <w:rPr>
+                <w:rFonts w:hint="default"/>
+                <w:b w:val="0"/>
+                <w:bCs w:val="0"/>
+                <w:lang w:val="en-US"/>
+              </w:rPr>
+              <w:t>Give  it   to  the  bank  manager and  the  procedure  is  folloewd</w:t>
+            </w:r>
+          </w:p>
+        </w:tc>
+      </w:tr>
+      <w:tr>
+        <w:tblPrEx>
+          <w:tblBorders>
+            <w:top w:val="single" w:color="auto" w:sz="4" w:space="0"/>
+            <w:left w:val="single" w:color="auto" w:sz="4" w:space="0"/>
+            <w:bottom w:val="single" w:color="auto" w:sz="4" w:space="0"/>
+            <w:right w:val="single" w:color="auto" w:sz="4" w:space="0"/>
+            <w:insideH w:val="single" w:color="auto" w:sz="4" w:space="0"/>
+            <w:insideV w:val="single" w:color="auto" w:sz="4" w:space="0"/>
+          </w:tblBorders>
+          <w:tblCellMar>
+            <w:top w:w="0" w:type="dxa"/>
+            <w:left w:w="108" w:type="dxa"/>
+            <w:bottom w:w="0" w:type="dxa"/>
+            <w:right w:w="108" w:type="dxa"/>
+          </w:tblCellMar>
+        </w:tblPrEx>
+        <w:trPr>
+          <w:trHeight w:val="2506" w:hRule="atLeast"/>
+        </w:trPr>
+        <w:tc>
+          <w:tcPr>
+            <w:tcW w:w="2840" w:type="dxa"/>
+            <w:vAlign w:val="top"/>
+          </w:tcPr>
+          <w:p>
+            <w:pPr>
+              <w:rPr>
+                <w:rFonts w:hint="default"/>
+                <w:vertAlign w:val="baseline"/>
+                <w:lang w:val="en-US"/>
+              </w:rPr>
+            </w:pPr>
+            <w:r>
+              <w:rPr>
+                <w:rFonts w:hint="default"/>
+                <w:vertAlign w:val="baseline"/>
+                <w:lang w:val="en-US"/>
+              </w:rPr>
+              <w:t>Compte</w:t>
+            </w:r>
+          </w:p>
+        </w:tc>
+        <w:tc>
+          <w:tcPr>
+            <w:tcW w:w="2841" w:type="dxa"/>
+            <w:vAlign w:val="top"/>
+          </w:tcPr>
+          <w:p>
+            <w:pPr>
+              <w:rPr>
+                <w:rFonts w:hint="default"/>
+                <w:vertAlign w:val="baseline"/>
+                <w:lang w:val="en-US"/>
+              </w:rPr>
+            </w:pPr>
+            <w:r>
+              <w:rPr>
+                <w:rFonts w:hint="default"/>
+                <w:vertAlign w:val="baseline"/>
+                <w:lang w:val="en-US"/>
+              </w:rPr>
+              <w:t>Comment consulter mon solde en ligne ?</w:t>
+            </w:r>
+          </w:p>
+        </w:tc>
+        <w:tc>
+          <w:tcPr>
+            <w:tcW w:w="3364" w:type="dxa"/>
+            <w:vAlign w:val="top"/>
+          </w:tcPr>
+          <w:p>
+            <w:pPr>
+              <w:numPr>
+                <w:ilvl w:val="0"/>
+                <w:numId w:val="3"/>
+              </w:numPr>
+              <w:ind w:left="420" w:leftChars="0" w:hanging="420" w:firstLineChars="0"/>
+              <w:rPr>
+                <w:rFonts w:hint="default"/>
+                <w:b w:val="0"/>
+                <w:bCs w:val="0"/>
+                <w:lang w:val="en-US"/>
+              </w:rPr>
+            </w:pPr>
+            <w:r>
+              <w:rPr>
+                <w:rFonts w:hint="default"/>
+                <w:b w:val="0"/>
+                <w:bCs w:val="0"/>
+                <w:lang w:val="en-US"/>
+              </w:rPr>
+              <w:t>Throught  the  bank  wallet</w:t>
+            </w:r>
+          </w:p>
+          <w:p>
+            <w:pPr>
+              <w:numPr>
+                <w:ilvl w:val="0"/>
+                <w:numId w:val="3"/>
+              </w:numPr>
+              <w:ind w:left="420" w:leftChars="0" w:hanging="420" w:firstLineChars="0"/>
+              <w:rPr>
+                <w:rFonts w:hint="default"/>
+                <w:b w:val="0"/>
+                <w:bCs w:val="0"/>
+                <w:lang w:val="en-US"/>
+              </w:rPr>
+            </w:pPr>
+            <w:r>
+              <w:rPr>
+                <w:rFonts w:hint="default"/>
+                <w:b w:val="0"/>
+                <w:bCs w:val="0"/>
+                <w:lang w:val="en-US"/>
+              </w:rPr>
+              <w:t>Moving  aplication</w:t>
+            </w:r>
+          </w:p>
+          <w:p>
+            <w:pPr>
+              <w:numPr>
+                <w:ilvl w:val="0"/>
+                <w:numId w:val="3"/>
+              </w:numPr>
+              <w:ind w:left="420" w:leftChars="0" w:hanging="420" w:firstLineChars="0"/>
+              <w:rPr>
+                <w:rFonts w:hint="default"/>
+                <w:b w:val="0"/>
+                <w:bCs w:val="0"/>
+                <w:lang w:val="en-US"/>
+              </w:rPr>
+            </w:pPr>
+            <w:r>
+              <w:rPr>
+                <w:rFonts w:hint="default"/>
+                <w:b w:val="0"/>
+                <w:bCs w:val="0"/>
+                <w:lang w:val="en-US"/>
+              </w:rPr>
+              <w:t>Sales  online</w:t>
+            </w:r>
+          </w:p>
+        </w:tc>
+      </w:tr>
+      <w:tr>
+        <w:tblPrEx>
+          <w:tblBorders>
+            <w:top w:val="single" w:color="auto" w:sz="4" w:space="0"/>
+            <w:left w:val="single" w:color="auto" w:sz="4" w:space="0"/>
+            <w:bottom w:val="single" w:color="auto" w:sz="4" w:space="0"/>
+            <w:right w:val="single" w:color="auto" w:sz="4" w:space="0"/>
+            <w:insideH w:val="single" w:color="auto" w:sz="4" w:space="0"/>
+            <w:insideV w:val="single" w:color="auto" w:sz="4" w:space="0"/>
+          </w:tblBorders>
+          <w:tblCellMar>
+            <w:top w:w="0" w:type="dxa"/>
+            <w:left w:w="108" w:type="dxa"/>
+            <w:bottom w:w="0" w:type="dxa"/>
+            <w:right w:w="108" w:type="dxa"/>
+          </w:tblCellMar>
+        </w:tblPrEx>
+        <w:trPr>
+          <w:trHeight w:val="2506" w:hRule="atLeast"/>
+        </w:trPr>
+        <w:tc>
+          <w:tcPr>
+            <w:tcW w:w="2840" w:type="dxa"/>
+            <w:vAlign w:val="top"/>
+          </w:tcPr>
+          <w:p>
+            <w:pPr>
+              <w:rPr>
+                <w:rFonts w:hint="default"/>
+                <w:vertAlign w:val="baseline"/>
+                <w:lang w:val="en-US"/>
+              </w:rPr>
+            </w:pPr>
+            <w:r>
+              <w:rPr>
+                <w:rFonts w:hint="default"/>
+                <w:vertAlign w:val="baseline"/>
+                <w:lang w:val="en-US"/>
+              </w:rPr>
+              <w:t>Carte Bancaire</w:t>
+            </w:r>
+          </w:p>
+        </w:tc>
+        <w:tc>
+          <w:tcPr>
+            <w:tcW w:w="2841" w:type="dxa"/>
+            <w:vAlign w:val="top"/>
+          </w:tcPr>
+          <w:p>
+            <w:pPr>
+              <w:rPr>
+                <w:rFonts w:hint="default"/>
+                <w:vertAlign w:val="baseline"/>
+                <w:lang w:val="en-US"/>
+              </w:rPr>
+            </w:pPr>
+            <w:r>
+              <w:rPr>
+                <w:rFonts w:hint="default"/>
+                <w:vertAlign w:val="baseline"/>
+                <w:lang w:val="en-US"/>
+              </w:rPr>
+              <w:t>Comment obtenir une carte bancaire?</w:t>
+            </w:r>
+          </w:p>
+        </w:tc>
+        <w:tc>
+          <w:tcPr>
+            <w:tcW w:w="3364" w:type="dxa"/>
+            <w:vAlign w:val="top"/>
+          </w:tcPr>
+          <w:p>
+            <w:pPr>
+              <w:numPr>
+                <w:ilvl w:val="0"/>
+                <w:numId w:val="3"/>
+              </w:numPr>
+              <w:ind w:left="420" w:leftChars="0" w:hanging="420" w:firstLineChars="0"/>
+              <w:rPr>
+                <w:rFonts w:hint="default"/>
+                <w:b w:val="0"/>
+                <w:bCs w:val="0"/>
+                <w:lang w:val="en-US"/>
+              </w:rPr>
+            </w:pPr>
+            <w:r>
+              <w:rPr>
+                <w:rFonts w:hint="default"/>
+                <w:b w:val="0"/>
+                <w:bCs w:val="0"/>
+                <w:lang w:val="en-US"/>
+              </w:rPr>
+              <w:t>By  subcription on an account</w:t>
+            </w:r>
+          </w:p>
+        </w:tc>
+      </w:tr>
+      <w:tr>
+        <w:tblPrEx>
+          <w:tblBorders>
+            <w:top w:val="single" w:color="auto" w:sz="4" w:space="0"/>
+            <w:left w:val="single" w:color="auto" w:sz="4" w:space="0"/>
+            <w:bottom w:val="single" w:color="auto" w:sz="4" w:space="0"/>
+            <w:right w:val="single" w:color="auto" w:sz="4" w:space="0"/>
+            <w:insideH w:val="single" w:color="auto" w:sz="4" w:space="0"/>
+            <w:insideV w:val="single" w:color="auto" w:sz="4" w:space="0"/>
+          </w:tblBorders>
+          <w:tblCellMar>
+            <w:top w:w="0" w:type="dxa"/>
+            <w:left w:w="108" w:type="dxa"/>
+            <w:bottom w:w="0" w:type="dxa"/>
+            <w:right w:w="108" w:type="dxa"/>
+          </w:tblCellMar>
+        </w:tblPrEx>
+        <w:trPr>
+          <w:trHeight w:val="2506" w:hRule="atLeast"/>
+        </w:trPr>
+        <w:tc>
+          <w:tcPr>
+            <w:tcW w:w="2840" w:type="dxa"/>
+            <w:vAlign w:val="top"/>
+          </w:tcPr>
+          <w:p>
+            <w:pPr>
+              <w:rPr>
+                <w:rFonts w:hint="default"/>
+                <w:vertAlign w:val="baseline"/>
+                <w:lang w:val="en-US"/>
+              </w:rPr>
+            </w:pPr>
+            <w:r>
+              <w:rPr>
+                <w:rFonts w:hint="default"/>
+                <w:vertAlign w:val="baseline"/>
+                <w:lang w:val="en-US"/>
+              </w:rPr>
+              <w:t>Carte Bancaire</w:t>
+            </w:r>
+          </w:p>
+        </w:tc>
+        <w:tc>
+          <w:tcPr>
+            <w:tcW w:w="2841" w:type="dxa"/>
+            <w:vAlign w:val="top"/>
+          </w:tcPr>
+          <w:p>
+            <w:pPr>
+              <w:rPr>
+                <w:rFonts w:hint="default"/>
+                <w:vertAlign w:val="baseline"/>
+                <w:lang w:val="en-US"/>
+              </w:rPr>
+            </w:pPr>
+            <w:r>
+              <w:rPr>
+                <w:rFonts w:hint="default"/>
+                <w:vertAlign w:val="baseline"/>
+                <w:lang w:val="en-US"/>
+              </w:rPr>
+              <w:t>Si ma carte est bloque, quoi faire?</w:t>
+            </w:r>
+          </w:p>
+        </w:tc>
+        <w:tc>
+          <w:tcPr>
+            <w:tcW w:w="3364" w:type="dxa"/>
+            <w:vAlign w:val="top"/>
+          </w:tcPr>
+          <w:p>
+            <w:pPr>
+              <w:numPr>
+                <w:ilvl w:val="0"/>
+                <w:numId w:val="3"/>
+              </w:numPr>
+              <w:ind w:left="420" w:leftChars="0" w:hanging="420" w:firstLineChars="0"/>
+              <w:rPr>
+                <w:rFonts w:hint="default"/>
+                <w:b w:val="0"/>
+                <w:bCs w:val="0"/>
+                <w:lang w:val="en-US"/>
+              </w:rPr>
+            </w:pPr>
+            <w:r>
+              <w:rPr>
+                <w:rFonts w:hint="default"/>
+                <w:b w:val="0"/>
+                <w:bCs w:val="0"/>
+                <w:lang w:val="en-US"/>
+              </w:rPr>
+              <w:t>Écrire un message pour informer la banque.</w:t>
+            </w:r>
+          </w:p>
+        </w:tc>
+      </w:tr>
+      <w:tr>
+        <w:tblPrEx>
+          <w:tblBorders>
+            <w:top w:val="single" w:color="auto" w:sz="4" w:space="0"/>
+            <w:left w:val="single" w:color="auto" w:sz="4" w:space="0"/>
+            <w:bottom w:val="single" w:color="auto" w:sz="4" w:space="0"/>
+            <w:right w:val="single" w:color="auto" w:sz="4" w:space="0"/>
+            <w:insideH w:val="single" w:color="auto" w:sz="4" w:space="0"/>
+            <w:insideV w:val="single" w:color="auto" w:sz="4" w:space="0"/>
+          </w:tblBorders>
+          <w:tblCellMar>
+            <w:top w:w="0" w:type="dxa"/>
+            <w:left w:w="108" w:type="dxa"/>
+            <w:bottom w:w="0" w:type="dxa"/>
+            <w:right w:w="108" w:type="dxa"/>
+          </w:tblCellMar>
+        </w:tblPrEx>
+        <w:trPr>
+          <w:trHeight w:val="2506" w:hRule="atLeast"/>
+        </w:trPr>
+        <w:tc>
+          <w:tcPr>
+            <w:tcW w:w="2840" w:type="dxa"/>
+            <w:vAlign w:val="top"/>
+          </w:tcPr>
+          <w:p>
+            <w:pPr>
+              <w:rPr>
+                <w:rFonts w:hint="default"/>
+                <w:vertAlign w:val="baseline"/>
+                <w:lang w:val="en-US"/>
+              </w:rPr>
+            </w:pPr>
+            <w:r>
+              <w:rPr>
+                <w:rFonts w:hint="default"/>
+                <w:vertAlign w:val="baseline"/>
+                <w:lang w:val="en-US"/>
+              </w:rPr>
+              <w:t>Carte Bancaire</w:t>
+            </w:r>
+          </w:p>
+        </w:tc>
+        <w:tc>
+          <w:tcPr>
+            <w:tcW w:w="2841" w:type="dxa"/>
+            <w:vAlign w:val="top"/>
+          </w:tcPr>
+          <w:p>
+            <w:pPr>
+              <w:rPr>
+                <w:rFonts w:hint="default"/>
+                <w:vertAlign w:val="baseline"/>
+                <w:lang w:val="en-US"/>
+              </w:rPr>
+            </w:pPr>
+            <w:r>
+              <w:rPr>
+                <w:rFonts w:hint="default"/>
+                <w:vertAlign w:val="baseline"/>
+                <w:lang w:val="en-US"/>
+              </w:rPr>
+              <w:t>Comment conclurer mon compte ?</w:t>
+            </w:r>
+          </w:p>
+        </w:tc>
+        <w:tc>
+          <w:tcPr>
+            <w:tcW w:w="3364" w:type="dxa"/>
+            <w:vAlign w:val="top"/>
+          </w:tcPr>
+          <w:p>
+            <w:pPr>
+              <w:numPr>
+                <w:ilvl w:val="0"/>
+                <w:numId w:val="3"/>
+              </w:numPr>
+              <w:ind w:left="420" w:leftChars="0" w:hanging="420" w:firstLineChars="0"/>
+              <w:rPr>
+                <w:rFonts w:hint="default"/>
+                <w:b w:val="0"/>
+                <w:bCs w:val="0"/>
+                <w:lang w:val="en-US"/>
+              </w:rPr>
+            </w:pPr>
+            <w:r>
+              <w:rPr>
+                <w:rFonts w:hint="default"/>
+                <w:b w:val="0"/>
+                <w:bCs w:val="0"/>
+                <w:lang w:val="en-US"/>
+              </w:rPr>
+              <w:t>Se rendre en aganece pour effectuer la conclure</w:t>
             </w:r>
             <w:bookmarkStart w:id="0" w:name="_GoBack"/>
             <w:bookmarkEnd w:id="0"/>
-            <w:r>
-              <w:rPr>
-                <w:rFonts w:hint="default"/>
-                <w:b w:val="0"/>
-                <w:bCs w:val="0"/>
-                <w:lang w:val="en-US"/>
-              </w:rPr>
-              <w:t xml:space="preserve"> vous voulez</w:t>
-            </w:r>
           </w:p>
         </w:tc>
       </w:tr>

</xml_diff>

<commit_message>
envoie par mail essaie 1
</commit_message>
<xml_diff>
--- a/backend/DATASET_CHATBOT.docx
+++ b/backend/DATASET_CHATBOT.docx
@@ -3164,7 +3164,7 @@
           </w:tblCellMar>
         </w:tblPrEx>
         <w:trPr>
-          <w:trHeight w:val="1423" w:hRule="atLeast"/>
+          <w:trHeight w:val="1202" w:hRule="atLeast"/>
         </w:trPr>
         <w:tc>
           <w:tcPr>
@@ -3351,6 +3351,8 @@
                 <w:lang w:val="en-US"/>
               </w:rPr>
             </w:pPr>
+            <w:bookmarkStart w:id="0" w:name="_GoBack"/>
+            <w:bookmarkEnd w:id="0"/>
             <w:r>
               <w:rPr>
                 <w:rFonts w:hint="default"/>
@@ -3550,7 +3552,7 @@
           </w:tblCellMar>
         </w:tblPrEx>
         <w:trPr>
-          <w:trHeight w:val="2506" w:hRule="atLeast"/>
+          <w:trHeight w:val="1801" w:hRule="atLeast"/>
         </w:trPr>
         <w:tc>
           <w:tcPr>
@@ -3671,7 +3673,7 @@
           </w:tblCellMar>
         </w:tblPrEx>
         <w:trPr>
-          <w:trHeight w:val="2506" w:hRule="atLeast"/>
+          <w:trHeight w:val="90" w:hRule="atLeast"/>
         </w:trPr>
         <w:tc>
           <w:tcPr>
@@ -3816,7 +3818,7 @@
           </w:tblCellMar>
         </w:tblPrEx>
         <w:trPr>
-          <w:trHeight w:val="2506" w:hRule="atLeast"/>
+          <w:trHeight w:val="1244" w:hRule="atLeast"/>
         </w:trPr>
         <w:tc>
           <w:tcPr>
@@ -3937,7 +3939,7 @@
           </w:tblCellMar>
         </w:tblPrEx>
         <w:trPr>
-          <w:trHeight w:val="2506" w:hRule="atLeast"/>
+          <w:trHeight w:val="453" w:hRule="atLeast"/>
         </w:trPr>
         <w:tc>
           <w:tcPr>
@@ -4082,7 +4084,7 @@
           </w:tblCellMar>
         </w:tblPrEx>
         <w:trPr>
-          <w:trHeight w:val="2506" w:hRule="atLeast"/>
+          <w:trHeight w:val="549" w:hRule="atLeast"/>
         </w:trPr>
         <w:tc>
           <w:tcPr>
@@ -4179,7 +4181,7 @@
           </w:tblCellMar>
         </w:tblPrEx>
         <w:trPr>
-          <w:trHeight w:val="2506" w:hRule="atLeast"/>
+          <w:trHeight w:val="749" w:hRule="atLeast"/>
         </w:trPr>
         <w:tc>
           <w:tcPr>
@@ -4276,7 +4278,7 @@
           </w:tblCellMar>
         </w:tblPrEx>
         <w:trPr>
-          <w:trHeight w:val="2506" w:hRule="atLeast"/>
+          <w:trHeight w:val="643" w:hRule="atLeast"/>
         </w:trPr>
         <w:tc>
           <w:tcPr>
@@ -4320,7 +4322,7 @@
                 <w:vertAlign w:val="baseline"/>
                 <w:lang w:val="en-US"/>
               </w:rPr>
-              <w:t>Comment conclurer mon compte ?</w:t>
+              <w:t>Comment conclurr mon compte ?</w:t>
             </w:r>
           </w:p>
         </w:tc>
@@ -4352,8 +4354,6 @@
               </w:rPr>
               <w:t>Se rendre en aganece pour effectuer la conclure</w:t>
             </w:r>
-            <w:bookmarkStart w:id="0" w:name="_GoBack"/>
-            <w:bookmarkEnd w:id="0"/>
           </w:p>
         </w:tc>
       </w:tr>

</xml_diff>